<commit_message>
site estático em andamento
</commit_message>
<xml_diff>
--- a/documentacao/Documentacao.docx
+++ b/documentacao/Documentacao.docx
@@ -3102,6 +3102,7 @@
   <w:style w:type="character" w:default="1" w:styleId="Fontepargpadro">
     <w:name w:val="Default Paragraph Font"/>
     <w:uiPriority w:val="1"/>
+    <w:semiHidden/>
     <w:unhideWhenUsed/>
   </w:style>
   <w:style w:type="table" w:default="1" w:styleId="Tabelanormal">
@@ -4046,7 +4047,9 @@
     <w:rsid w:val="0032558A"/>
     <w:rsid w:val="00336CFE"/>
     <w:rsid w:val="004A7524"/>
+    <w:rsid w:val="00562C65"/>
     <w:rsid w:val="00C829A1"/>
+    <w:rsid w:val="00D83CEB"/>
     <w:rsid w:val="00DF2822"/>
     <w:rsid w:val="00E73D45"/>
   </w:rsids>
@@ -4835,130 +4838,12 @@
 </file>
 
 <file path=customXml/item3.xml><?xml version="1.0" encoding="utf-8"?>
-<p:properties xmlns:p="http://schemas.microsoft.com/office/2006/metadata/properties" xmlns:xsi="http://www.w3.org/2001/XMLSchema-instance" xmlns:pc="http://schemas.microsoft.com/office/infopath/2007/PartnerControls">
-  <documentManagement>
-    <DirectSourceMarket xmlns="e5d022ff-4ce9-4922-b5a4-f245e35e2aac">english</DirectSourceMarket>
-    <LocComments xmlns="e5d022ff-4ce9-4922-b5a4-f245e35e2aac" xsi:nil="true"/>
-    <MarketSpecific xmlns="e5d022ff-4ce9-4922-b5a4-f245e35e2aac">false</MarketSpecific>
-    <ApprovalStatus xmlns="e5d022ff-4ce9-4922-b5a4-f245e35e2aac">InProgress</ApprovalStatus>
-    <ThumbnailAssetId xmlns="e5d022ff-4ce9-4922-b5a4-f245e35e2aac" xsi:nil="true"/>
-    <PrimaryImageGen xmlns="e5d022ff-4ce9-4922-b5a4-f245e35e2aac">true</PrimaryImageGen>
-    <LegacyData xmlns="e5d022ff-4ce9-4922-b5a4-f245e35e2aac" xsi:nil="true"/>
-    <TPFriendlyName xmlns="e5d022ff-4ce9-4922-b5a4-f245e35e2aac" xsi:nil="true"/>
-    <NumericId xmlns="e5d022ff-4ce9-4922-b5a4-f245e35e2aac" xsi:nil="true"/>
-    <LocRecommendedHandoff xmlns="e5d022ff-4ce9-4922-b5a4-f245e35e2aac" xsi:nil="true"/>
-    <BlockPublish xmlns="e5d022ff-4ce9-4922-b5a4-f245e35e2aac">false</BlockPublish>
-    <BusinessGroup xmlns="e5d022ff-4ce9-4922-b5a4-f245e35e2aac" xsi:nil="true"/>
-    <SourceTitle xmlns="e5d022ff-4ce9-4922-b5a4-f245e35e2aac" xsi:nil="true"/>
-    <OpenTemplate xmlns="e5d022ff-4ce9-4922-b5a4-f245e35e2aac">true</OpenTemplate>
-    <APEditor xmlns="e5d022ff-4ce9-4922-b5a4-f245e35e2aac">
-      <UserInfo>
-        <DisplayName/>
-        <AccountId xsi:nil="true"/>
-        <AccountType/>
-      </UserInfo>
-    </APEditor>
-    <UALocComments xmlns="e5d022ff-4ce9-4922-b5a4-f245e35e2aac" xsi:nil="true"/>
-    <ParentAssetId xmlns="e5d022ff-4ce9-4922-b5a4-f245e35e2aac" xsi:nil="true"/>
-    <PublishStatusLookup xmlns="e5d022ff-4ce9-4922-b5a4-f245e35e2aac">
-      <Value>417660</Value>
-      <Value>417661</Value>
-    </PublishStatusLookup>
-    <FeatureTagsTaxHTField0 xmlns="e5d022ff-4ce9-4922-b5a4-f245e35e2aac">
-      <Terms xmlns="http://schemas.microsoft.com/office/infopath/2007/PartnerControls"/>
-    </FeatureTagsTaxHTField0>
-    <IntlLangReviewDate xmlns="e5d022ff-4ce9-4922-b5a4-f245e35e2aac" xsi:nil="true"/>
-    <Providers xmlns="e5d022ff-4ce9-4922-b5a4-f245e35e2aac" xsi:nil="true"/>
-    <MachineTranslated xmlns="e5d022ff-4ce9-4922-b5a4-f245e35e2aac">false</MachineTranslated>
-    <OriginalSourceMarket xmlns="e5d022ff-4ce9-4922-b5a4-f245e35e2aac">english</OriginalSourceMarket>
-    <APDescription xmlns="e5d022ff-4ce9-4922-b5a4-f245e35e2aac">Use esse currículo elegante para uma aparência profissional. Acompanhe-o com uma carta de apresentação do conjunto de designs Atemporal para causar uma boa impressão.
-</APDescription>
-    <TPInstallLocation xmlns="e5d022ff-4ce9-4922-b5a4-f245e35e2aac" xsi:nil="true"/>
-    <ContentItem xmlns="e5d022ff-4ce9-4922-b5a4-f245e35e2aac" xsi:nil="true"/>
-    <ClipArtFilename xmlns="e5d022ff-4ce9-4922-b5a4-f245e35e2aac" xsi:nil="true"/>
-    <PublishTargets xmlns="e5d022ff-4ce9-4922-b5a4-f245e35e2aac">OfficeOnlineVNext,OfflineBuild</PublishTargets>
-    <TimesCloned xmlns="e5d022ff-4ce9-4922-b5a4-f245e35e2aac" xsi:nil="true"/>
-    <FriendlyTitle xmlns="e5d022ff-4ce9-4922-b5a4-f245e35e2aac" xsi:nil="true"/>
-    <AcquiredFrom xmlns="e5d022ff-4ce9-4922-b5a4-f245e35e2aac">Internal MS</AcquiredFrom>
-    <AssetStart xmlns="e5d022ff-4ce9-4922-b5a4-f245e35e2aac">2012-03-08T00:28:00+00:00</AssetStart>
-    <Provider xmlns="e5d022ff-4ce9-4922-b5a4-f245e35e2aac" xsi:nil="true"/>
-    <LastHandOff xmlns="e5d022ff-4ce9-4922-b5a4-f245e35e2aac" xsi:nil="true"/>
-    <LocalizationTagsTaxHTField0 xmlns="e5d022ff-4ce9-4922-b5a4-f245e35e2aac">
-      <Terms xmlns="http://schemas.microsoft.com/office/infopath/2007/PartnerControls"/>
-    </LocalizationTagsTaxHTField0>
-    <TPClientViewer xmlns="e5d022ff-4ce9-4922-b5a4-f245e35e2aac" xsi:nil="true"/>
-    <UACurrentWords xmlns="e5d022ff-4ce9-4922-b5a4-f245e35e2aac" xsi:nil="true"/>
-    <ArtSampleDocs xmlns="e5d022ff-4ce9-4922-b5a4-f245e35e2aac" xsi:nil="true"/>
-    <UALocRecommendation xmlns="e5d022ff-4ce9-4922-b5a4-f245e35e2aac">Localize</UALocRecommendation>
-    <Manager xmlns="e5d022ff-4ce9-4922-b5a4-f245e35e2aac" xsi:nil="true"/>
-    <CSXHash xmlns="e5d022ff-4ce9-4922-b5a4-f245e35e2aac" xsi:nil="true"/>
-    <IsDeleted xmlns="e5d022ff-4ce9-4922-b5a4-f245e35e2aac">false</IsDeleted>
-    <ShowIn xmlns="e5d022ff-4ce9-4922-b5a4-f245e35e2aac">Show everywhere</ShowIn>
-    <UANotes xmlns="e5d022ff-4ce9-4922-b5a4-f245e35e2aac" xsi:nil="true"/>
-    <TemplateStatus xmlns="e5d022ff-4ce9-4922-b5a4-f245e35e2aac">Complete</TemplateStatus>
-    <Downloads xmlns="e5d022ff-4ce9-4922-b5a4-f245e35e2aac">0</Downloads>
-    <VoteCount xmlns="e5d022ff-4ce9-4922-b5a4-f245e35e2aac" xsi:nil="true"/>
-    <OOCacheId xmlns="e5d022ff-4ce9-4922-b5a4-f245e35e2aac" xsi:nil="true"/>
-    <InternalTagsTaxHTField0 xmlns="e5d022ff-4ce9-4922-b5a4-f245e35e2aac">
-      <Terms xmlns="http://schemas.microsoft.com/office/infopath/2007/PartnerControls"/>
-    </InternalTagsTaxHTField0>
-    <AssetExpire xmlns="e5d022ff-4ce9-4922-b5a4-f245e35e2aac">2029-01-01T08:00:00+00:00</AssetExpire>
-    <CSXSubmissionMarket xmlns="e5d022ff-4ce9-4922-b5a4-f245e35e2aac" xsi:nil="true"/>
-    <DSATActionTaken xmlns="e5d022ff-4ce9-4922-b5a4-f245e35e2aac" xsi:nil="true"/>
-    <TPExecutable xmlns="e5d022ff-4ce9-4922-b5a4-f245e35e2aac" xsi:nil="true"/>
-    <SubmitterId xmlns="e5d022ff-4ce9-4922-b5a4-f245e35e2aac" xsi:nil="true"/>
-    <EditorialTags xmlns="e5d022ff-4ce9-4922-b5a4-f245e35e2aac" xsi:nil="true"/>
-    <AssetType xmlns="e5d022ff-4ce9-4922-b5a4-f245e35e2aac">TP</AssetType>
-    <CSXSubmissionDate xmlns="e5d022ff-4ce9-4922-b5a4-f245e35e2aac" xsi:nil="true"/>
-    <CSXUpdate xmlns="e5d022ff-4ce9-4922-b5a4-f245e35e2aac">false</CSXUpdate>
-    <ApprovalLog xmlns="e5d022ff-4ce9-4922-b5a4-f245e35e2aac" xsi:nil="true"/>
-    <BugNumber xmlns="e5d022ff-4ce9-4922-b5a4-f245e35e2aac" xsi:nil="true"/>
-    <Milestone xmlns="e5d022ff-4ce9-4922-b5a4-f245e35e2aac" xsi:nil="true"/>
-    <OriginAsset xmlns="e5d022ff-4ce9-4922-b5a4-f245e35e2aac" xsi:nil="true"/>
-    <TPComponent xmlns="e5d022ff-4ce9-4922-b5a4-f245e35e2aac" xsi:nil="true"/>
-    <RecommendationsModifier xmlns="e5d022ff-4ce9-4922-b5a4-f245e35e2aac">1000</RecommendationsModifier>
-    <AssetId xmlns="e5d022ff-4ce9-4922-b5a4-f245e35e2aac">TP102835054</AssetId>
-    <TPApplication xmlns="e5d022ff-4ce9-4922-b5a4-f245e35e2aac" xsi:nil="true"/>
-    <TPLaunchHelpLink xmlns="e5d022ff-4ce9-4922-b5a4-f245e35e2aac" xsi:nil="true"/>
-    <PolicheckWords xmlns="e5d022ff-4ce9-4922-b5a4-f245e35e2aac" xsi:nil="true"/>
-    <IntlLocPriority xmlns="e5d022ff-4ce9-4922-b5a4-f245e35e2aac" xsi:nil="true"/>
-    <CrawlForDependencies xmlns="e5d022ff-4ce9-4922-b5a4-f245e35e2aac">false</CrawlForDependencies>
-    <IntlLangReviewer xmlns="e5d022ff-4ce9-4922-b5a4-f245e35e2aac" xsi:nil="true"/>
-    <HandoffToMSDN xmlns="e5d022ff-4ce9-4922-b5a4-f245e35e2aac" xsi:nil="true"/>
-    <PlannedPubDate xmlns="e5d022ff-4ce9-4922-b5a4-f245e35e2aac" xsi:nil="true"/>
-    <TrustLevel xmlns="e5d022ff-4ce9-4922-b5a4-f245e35e2aac">1 Microsoft Managed Content</TrustLevel>
-    <LocLastLocAttemptVersionLookup xmlns="e5d022ff-4ce9-4922-b5a4-f245e35e2aac">827850</LocLastLocAttemptVersionLookup>
-    <TemplateTemplateType xmlns="e5d022ff-4ce9-4922-b5a4-f245e35e2aac">Word Document Template</TemplateTemplateType>
-    <IsSearchable xmlns="e5d022ff-4ce9-4922-b5a4-f245e35e2aac">true</IsSearchable>
-    <TPNamespace xmlns="e5d022ff-4ce9-4922-b5a4-f245e35e2aac" xsi:nil="true"/>
-    <CampaignTagsTaxHTField0 xmlns="e5d022ff-4ce9-4922-b5a4-f245e35e2aac">
-      <Terms xmlns="http://schemas.microsoft.com/office/infopath/2007/PartnerControls"/>
-    </CampaignTagsTaxHTField0>
-    <TaxCatchAll xmlns="e5d022ff-4ce9-4922-b5a4-f245e35e2aac"/>
-    <Markets xmlns="e5d022ff-4ce9-4922-b5a4-f245e35e2aac"/>
-    <IntlLangReview xmlns="e5d022ff-4ce9-4922-b5a4-f245e35e2aac">false</IntlLangReview>
-    <UAProjectedTotalWords xmlns="e5d022ff-4ce9-4922-b5a4-f245e35e2aac" xsi:nil="true"/>
-    <OutputCachingOn xmlns="e5d022ff-4ce9-4922-b5a4-f245e35e2aac">false</OutputCachingOn>
-    <LocMarketGroupTiers2 xmlns="e5d022ff-4ce9-4922-b5a4-f245e35e2aac" xsi:nil="true"/>
-    <TPAppVersion xmlns="e5d022ff-4ce9-4922-b5a4-f245e35e2aac" xsi:nil="true"/>
-    <TPCommandLine xmlns="e5d022ff-4ce9-4922-b5a4-f245e35e2aac" xsi:nil="true"/>
-    <APAuthor xmlns="e5d022ff-4ce9-4922-b5a4-f245e35e2aac">
-      <UserInfo>
-        <DisplayName>REDMOND\kristaa</DisplayName>
-        <AccountId>81</AccountId>
-        <AccountType/>
-      </UserInfo>
-    </APAuthor>
-    <LocManualTestRequired xmlns="e5d022ff-4ce9-4922-b5a4-f245e35e2aac">false</LocManualTestRequired>
-    <EditorialStatus xmlns="e5d022ff-4ce9-4922-b5a4-f245e35e2aac">Complete</EditorialStatus>
-    <TPLaunchHelpLinkType xmlns="e5d022ff-4ce9-4922-b5a4-f245e35e2aac">Template</TPLaunchHelpLinkType>
-    <OriginalRelease xmlns="e5d022ff-4ce9-4922-b5a4-f245e35e2aac">15</OriginalRelease>
-    <LastModifiedDateTime xmlns="e5d022ff-4ce9-4922-b5a4-f245e35e2aac" xsi:nil="true"/>
-    <ScenarioTagsTaxHTField0 xmlns="e5d022ff-4ce9-4922-b5a4-f245e35e2aac">
-      <Terms xmlns="http://schemas.microsoft.com/office/infopath/2007/PartnerControls"/>
-    </ScenarioTagsTaxHTField0>
-  </documentManagement>
-</p:properties>
+<?mso-contentType ?>
+<FormTemplates xmlns="http://schemas.microsoft.com/sharepoint/v3/contenttype/forms">
+  <Display>DocumentLibraryForm</Display>
+  <Edit>AssetEditForm</Edit>
+  <New>DocumentLibraryForm</New>
+</FormTemplates>
 </file>
 
 <file path=customXml/item4.xml><?xml version="1.0" encoding="utf-8"?>
@@ -5996,12 +5881,130 @@
 </file>
 
 <file path=customXml/item5.xml><?xml version="1.0" encoding="utf-8"?>
-<?mso-contentType ?>
-<FormTemplates xmlns="http://schemas.microsoft.com/sharepoint/v3/contenttype/forms">
-  <Display>DocumentLibraryForm</Display>
-  <Edit>AssetEditForm</Edit>
-  <New>DocumentLibraryForm</New>
-</FormTemplates>
+<p:properties xmlns:p="http://schemas.microsoft.com/office/2006/metadata/properties" xmlns:xsi="http://www.w3.org/2001/XMLSchema-instance" xmlns:pc="http://schemas.microsoft.com/office/infopath/2007/PartnerControls">
+  <documentManagement>
+    <DirectSourceMarket xmlns="e5d022ff-4ce9-4922-b5a4-f245e35e2aac">english</DirectSourceMarket>
+    <LocComments xmlns="e5d022ff-4ce9-4922-b5a4-f245e35e2aac" xsi:nil="true"/>
+    <MarketSpecific xmlns="e5d022ff-4ce9-4922-b5a4-f245e35e2aac">false</MarketSpecific>
+    <ApprovalStatus xmlns="e5d022ff-4ce9-4922-b5a4-f245e35e2aac">InProgress</ApprovalStatus>
+    <ThumbnailAssetId xmlns="e5d022ff-4ce9-4922-b5a4-f245e35e2aac" xsi:nil="true"/>
+    <PrimaryImageGen xmlns="e5d022ff-4ce9-4922-b5a4-f245e35e2aac">true</PrimaryImageGen>
+    <LegacyData xmlns="e5d022ff-4ce9-4922-b5a4-f245e35e2aac" xsi:nil="true"/>
+    <TPFriendlyName xmlns="e5d022ff-4ce9-4922-b5a4-f245e35e2aac" xsi:nil="true"/>
+    <NumericId xmlns="e5d022ff-4ce9-4922-b5a4-f245e35e2aac" xsi:nil="true"/>
+    <LocRecommendedHandoff xmlns="e5d022ff-4ce9-4922-b5a4-f245e35e2aac" xsi:nil="true"/>
+    <BlockPublish xmlns="e5d022ff-4ce9-4922-b5a4-f245e35e2aac">false</BlockPublish>
+    <BusinessGroup xmlns="e5d022ff-4ce9-4922-b5a4-f245e35e2aac" xsi:nil="true"/>
+    <SourceTitle xmlns="e5d022ff-4ce9-4922-b5a4-f245e35e2aac" xsi:nil="true"/>
+    <OpenTemplate xmlns="e5d022ff-4ce9-4922-b5a4-f245e35e2aac">true</OpenTemplate>
+    <APEditor xmlns="e5d022ff-4ce9-4922-b5a4-f245e35e2aac">
+      <UserInfo>
+        <DisplayName/>
+        <AccountId xsi:nil="true"/>
+        <AccountType/>
+      </UserInfo>
+    </APEditor>
+    <UALocComments xmlns="e5d022ff-4ce9-4922-b5a4-f245e35e2aac" xsi:nil="true"/>
+    <ParentAssetId xmlns="e5d022ff-4ce9-4922-b5a4-f245e35e2aac" xsi:nil="true"/>
+    <PublishStatusLookup xmlns="e5d022ff-4ce9-4922-b5a4-f245e35e2aac">
+      <Value>417660</Value>
+      <Value>417661</Value>
+    </PublishStatusLookup>
+    <FeatureTagsTaxHTField0 xmlns="e5d022ff-4ce9-4922-b5a4-f245e35e2aac">
+      <Terms xmlns="http://schemas.microsoft.com/office/infopath/2007/PartnerControls"/>
+    </FeatureTagsTaxHTField0>
+    <IntlLangReviewDate xmlns="e5d022ff-4ce9-4922-b5a4-f245e35e2aac" xsi:nil="true"/>
+    <Providers xmlns="e5d022ff-4ce9-4922-b5a4-f245e35e2aac" xsi:nil="true"/>
+    <MachineTranslated xmlns="e5d022ff-4ce9-4922-b5a4-f245e35e2aac">false</MachineTranslated>
+    <OriginalSourceMarket xmlns="e5d022ff-4ce9-4922-b5a4-f245e35e2aac">english</OriginalSourceMarket>
+    <APDescription xmlns="e5d022ff-4ce9-4922-b5a4-f245e35e2aac">Use esse currículo elegante para uma aparência profissional. Acompanhe-o com uma carta de apresentação do conjunto de designs Atemporal para causar uma boa impressão.
+</APDescription>
+    <TPInstallLocation xmlns="e5d022ff-4ce9-4922-b5a4-f245e35e2aac" xsi:nil="true"/>
+    <ContentItem xmlns="e5d022ff-4ce9-4922-b5a4-f245e35e2aac" xsi:nil="true"/>
+    <ClipArtFilename xmlns="e5d022ff-4ce9-4922-b5a4-f245e35e2aac" xsi:nil="true"/>
+    <PublishTargets xmlns="e5d022ff-4ce9-4922-b5a4-f245e35e2aac">OfficeOnlineVNext,OfflineBuild</PublishTargets>
+    <TimesCloned xmlns="e5d022ff-4ce9-4922-b5a4-f245e35e2aac" xsi:nil="true"/>
+    <FriendlyTitle xmlns="e5d022ff-4ce9-4922-b5a4-f245e35e2aac" xsi:nil="true"/>
+    <AcquiredFrom xmlns="e5d022ff-4ce9-4922-b5a4-f245e35e2aac">Internal MS</AcquiredFrom>
+    <AssetStart xmlns="e5d022ff-4ce9-4922-b5a4-f245e35e2aac">2012-03-08T00:28:00+00:00</AssetStart>
+    <Provider xmlns="e5d022ff-4ce9-4922-b5a4-f245e35e2aac" xsi:nil="true"/>
+    <LastHandOff xmlns="e5d022ff-4ce9-4922-b5a4-f245e35e2aac" xsi:nil="true"/>
+    <LocalizationTagsTaxHTField0 xmlns="e5d022ff-4ce9-4922-b5a4-f245e35e2aac">
+      <Terms xmlns="http://schemas.microsoft.com/office/infopath/2007/PartnerControls"/>
+    </LocalizationTagsTaxHTField0>
+    <TPClientViewer xmlns="e5d022ff-4ce9-4922-b5a4-f245e35e2aac" xsi:nil="true"/>
+    <UACurrentWords xmlns="e5d022ff-4ce9-4922-b5a4-f245e35e2aac" xsi:nil="true"/>
+    <ArtSampleDocs xmlns="e5d022ff-4ce9-4922-b5a4-f245e35e2aac" xsi:nil="true"/>
+    <UALocRecommendation xmlns="e5d022ff-4ce9-4922-b5a4-f245e35e2aac">Localize</UALocRecommendation>
+    <Manager xmlns="e5d022ff-4ce9-4922-b5a4-f245e35e2aac" xsi:nil="true"/>
+    <CSXHash xmlns="e5d022ff-4ce9-4922-b5a4-f245e35e2aac" xsi:nil="true"/>
+    <IsDeleted xmlns="e5d022ff-4ce9-4922-b5a4-f245e35e2aac">false</IsDeleted>
+    <ShowIn xmlns="e5d022ff-4ce9-4922-b5a4-f245e35e2aac">Show everywhere</ShowIn>
+    <UANotes xmlns="e5d022ff-4ce9-4922-b5a4-f245e35e2aac" xsi:nil="true"/>
+    <TemplateStatus xmlns="e5d022ff-4ce9-4922-b5a4-f245e35e2aac">Complete</TemplateStatus>
+    <Downloads xmlns="e5d022ff-4ce9-4922-b5a4-f245e35e2aac">0</Downloads>
+    <VoteCount xmlns="e5d022ff-4ce9-4922-b5a4-f245e35e2aac" xsi:nil="true"/>
+    <OOCacheId xmlns="e5d022ff-4ce9-4922-b5a4-f245e35e2aac" xsi:nil="true"/>
+    <InternalTagsTaxHTField0 xmlns="e5d022ff-4ce9-4922-b5a4-f245e35e2aac">
+      <Terms xmlns="http://schemas.microsoft.com/office/infopath/2007/PartnerControls"/>
+    </InternalTagsTaxHTField0>
+    <AssetExpire xmlns="e5d022ff-4ce9-4922-b5a4-f245e35e2aac">2029-01-01T08:00:00+00:00</AssetExpire>
+    <CSXSubmissionMarket xmlns="e5d022ff-4ce9-4922-b5a4-f245e35e2aac" xsi:nil="true"/>
+    <DSATActionTaken xmlns="e5d022ff-4ce9-4922-b5a4-f245e35e2aac" xsi:nil="true"/>
+    <TPExecutable xmlns="e5d022ff-4ce9-4922-b5a4-f245e35e2aac" xsi:nil="true"/>
+    <SubmitterId xmlns="e5d022ff-4ce9-4922-b5a4-f245e35e2aac" xsi:nil="true"/>
+    <EditorialTags xmlns="e5d022ff-4ce9-4922-b5a4-f245e35e2aac" xsi:nil="true"/>
+    <AssetType xmlns="e5d022ff-4ce9-4922-b5a4-f245e35e2aac">TP</AssetType>
+    <CSXSubmissionDate xmlns="e5d022ff-4ce9-4922-b5a4-f245e35e2aac" xsi:nil="true"/>
+    <CSXUpdate xmlns="e5d022ff-4ce9-4922-b5a4-f245e35e2aac">false</CSXUpdate>
+    <ApprovalLog xmlns="e5d022ff-4ce9-4922-b5a4-f245e35e2aac" xsi:nil="true"/>
+    <BugNumber xmlns="e5d022ff-4ce9-4922-b5a4-f245e35e2aac" xsi:nil="true"/>
+    <Milestone xmlns="e5d022ff-4ce9-4922-b5a4-f245e35e2aac" xsi:nil="true"/>
+    <OriginAsset xmlns="e5d022ff-4ce9-4922-b5a4-f245e35e2aac" xsi:nil="true"/>
+    <TPComponent xmlns="e5d022ff-4ce9-4922-b5a4-f245e35e2aac" xsi:nil="true"/>
+    <RecommendationsModifier xmlns="e5d022ff-4ce9-4922-b5a4-f245e35e2aac">1000</RecommendationsModifier>
+    <AssetId xmlns="e5d022ff-4ce9-4922-b5a4-f245e35e2aac">TP102835054</AssetId>
+    <TPApplication xmlns="e5d022ff-4ce9-4922-b5a4-f245e35e2aac" xsi:nil="true"/>
+    <TPLaunchHelpLink xmlns="e5d022ff-4ce9-4922-b5a4-f245e35e2aac" xsi:nil="true"/>
+    <PolicheckWords xmlns="e5d022ff-4ce9-4922-b5a4-f245e35e2aac" xsi:nil="true"/>
+    <IntlLocPriority xmlns="e5d022ff-4ce9-4922-b5a4-f245e35e2aac" xsi:nil="true"/>
+    <CrawlForDependencies xmlns="e5d022ff-4ce9-4922-b5a4-f245e35e2aac">false</CrawlForDependencies>
+    <IntlLangReviewer xmlns="e5d022ff-4ce9-4922-b5a4-f245e35e2aac" xsi:nil="true"/>
+    <HandoffToMSDN xmlns="e5d022ff-4ce9-4922-b5a4-f245e35e2aac" xsi:nil="true"/>
+    <PlannedPubDate xmlns="e5d022ff-4ce9-4922-b5a4-f245e35e2aac" xsi:nil="true"/>
+    <TrustLevel xmlns="e5d022ff-4ce9-4922-b5a4-f245e35e2aac">1 Microsoft Managed Content</TrustLevel>
+    <LocLastLocAttemptVersionLookup xmlns="e5d022ff-4ce9-4922-b5a4-f245e35e2aac">827850</LocLastLocAttemptVersionLookup>
+    <TemplateTemplateType xmlns="e5d022ff-4ce9-4922-b5a4-f245e35e2aac">Word Document Template</TemplateTemplateType>
+    <IsSearchable xmlns="e5d022ff-4ce9-4922-b5a4-f245e35e2aac">true</IsSearchable>
+    <TPNamespace xmlns="e5d022ff-4ce9-4922-b5a4-f245e35e2aac" xsi:nil="true"/>
+    <CampaignTagsTaxHTField0 xmlns="e5d022ff-4ce9-4922-b5a4-f245e35e2aac">
+      <Terms xmlns="http://schemas.microsoft.com/office/infopath/2007/PartnerControls"/>
+    </CampaignTagsTaxHTField0>
+    <TaxCatchAll xmlns="e5d022ff-4ce9-4922-b5a4-f245e35e2aac"/>
+    <Markets xmlns="e5d022ff-4ce9-4922-b5a4-f245e35e2aac"/>
+    <IntlLangReview xmlns="e5d022ff-4ce9-4922-b5a4-f245e35e2aac">false</IntlLangReview>
+    <UAProjectedTotalWords xmlns="e5d022ff-4ce9-4922-b5a4-f245e35e2aac" xsi:nil="true"/>
+    <OutputCachingOn xmlns="e5d022ff-4ce9-4922-b5a4-f245e35e2aac">false</OutputCachingOn>
+    <LocMarketGroupTiers2 xmlns="e5d022ff-4ce9-4922-b5a4-f245e35e2aac" xsi:nil="true"/>
+    <TPAppVersion xmlns="e5d022ff-4ce9-4922-b5a4-f245e35e2aac" xsi:nil="true"/>
+    <TPCommandLine xmlns="e5d022ff-4ce9-4922-b5a4-f245e35e2aac" xsi:nil="true"/>
+    <APAuthor xmlns="e5d022ff-4ce9-4922-b5a4-f245e35e2aac">
+      <UserInfo>
+        <DisplayName>REDMOND\kristaa</DisplayName>
+        <AccountId>81</AccountId>
+        <AccountType/>
+      </UserInfo>
+    </APAuthor>
+    <LocManualTestRequired xmlns="e5d022ff-4ce9-4922-b5a4-f245e35e2aac">false</LocManualTestRequired>
+    <EditorialStatus xmlns="e5d022ff-4ce9-4922-b5a4-f245e35e2aac">Complete</EditorialStatus>
+    <TPLaunchHelpLinkType xmlns="e5d022ff-4ce9-4922-b5a4-f245e35e2aac">Template</TPLaunchHelpLinkType>
+    <OriginalRelease xmlns="e5d022ff-4ce9-4922-b5a4-f245e35e2aac">15</OriginalRelease>
+    <LastModifiedDateTime xmlns="e5d022ff-4ce9-4922-b5a4-f245e35e2aac" xsi:nil="true"/>
+    <ScenarioTagsTaxHTField0 xmlns="e5d022ff-4ce9-4922-b5a4-f245e35e2aac">
+      <Terms xmlns="http://schemas.microsoft.com/office/infopath/2007/PartnerControls"/>
+    </ScenarioTagsTaxHTField0>
+  </documentManagement>
+</p:properties>
 </file>
 
 <file path=customXml/itemProps1.xml><?xml version="1.0" encoding="utf-8"?>
@@ -6021,11 +6024,9 @@
 </file>
 
 <file path=customXml/itemProps3.xml><?xml version="1.0" encoding="utf-8"?>
-<ds:datastoreItem xmlns:ds="http://schemas.openxmlformats.org/officeDocument/2006/customXml" ds:itemID="{D3EBC2B9-6CE6-485C-8397-87D481EF78BE}">
+<ds:datastoreItem xmlns:ds="http://schemas.openxmlformats.org/officeDocument/2006/customXml" ds:itemID="{A0077783-2CE4-4ACE-A7FB-5A37CE1D65A3}">
   <ds:schemaRefs>
-    <ds:schemaRef ds:uri="http://schemas.microsoft.com/office/2006/metadata/properties"/>
-    <ds:schemaRef ds:uri="http://schemas.microsoft.com/office/infopath/2007/PartnerControls"/>
-    <ds:schemaRef ds:uri="e5d022ff-4ce9-4922-b5a4-f245e35e2aac"/>
+    <ds:schemaRef ds:uri="http://schemas.microsoft.com/sharepoint/v3/contenttype/forms"/>
   </ds:schemaRefs>
 </ds:datastoreItem>
 </file>
@@ -6049,9 +6050,11 @@
 </file>
 
 <file path=customXml/itemProps5.xml><?xml version="1.0" encoding="utf-8"?>
-<ds:datastoreItem xmlns:ds="http://schemas.openxmlformats.org/officeDocument/2006/customXml" ds:itemID="{A0077783-2CE4-4ACE-A7FB-5A37CE1D65A3}">
+<ds:datastoreItem xmlns:ds="http://schemas.openxmlformats.org/officeDocument/2006/customXml" ds:itemID="{D3EBC2B9-6CE6-485C-8397-87D481EF78BE}">
   <ds:schemaRefs>
-    <ds:schemaRef ds:uri="http://schemas.microsoft.com/sharepoint/v3/contenttype/forms"/>
+    <ds:schemaRef ds:uri="http://schemas.microsoft.com/office/2006/metadata/properties"/>
+    <ds:schemaRef ds:uri="http://schemas.microsoft.com/office/infopath/2007/PartnerControls"/>
+    <ds:schemaRef ds:uri="e5d022ff-4ce9-4922-b5a4-f245e35e2aac"/>
   </ds:schemaRefs>
 </ds:datastoreItem>
 </file>
</xml_diff>

<commit_message>
novas atualizações:books checklist+cadastro & login
</commit_message>
<xml_diff>
--- a/documentacao/Documentacao.docx
+++ b/documentacao/Documentacao.docx
@@ -1836,18 +1836,6 @@
           <w:szCs w:val="28"/>
         </w:rPr>
       </w:pPr>
-      <w:r>
-        <w:rPr>
-          <w:rFonts w:ascii="Arial" w:eastAsiaTheme="minorEastAsia" w:hAnsi="Arial" w:cs="Arial"/>
-          <w:b/>
-          <w:bCs/>
-          <w:color w:val="577188" w:themeColor="accent1" w:themeShade="BF"/>
-          <w:kern w:val="0"/>
-          <w:sz w:val="28"/>
-          <w:szCs w:val="28"/>
-        </w:rPr>
-        <w:t>Diagrama de visão de negócio</w:t>
-      </w:r>
     </w:p>
     <w:p>
       <w:pPr>
@@ -1858,60 +1846,6 @@
           <w:bCs/>
           <w:color w:val="577188" w:themeColor="accent1" w:themeShade="BF"/>
           <w:kern w:val="0"/>
-          <w:sz w:val="28"/>
-          <w:szCs w:val="28"/>
-        </w:rPr>
-      </w:pPr>
-    </w:p>
-    <w:p>
-      <w:pPr>
-        <w:spacing w:before="100" w:beforeAutospacing="1" w:after="100" w:afterAutospacing="1" w:line="240" w:lineRule="auto"/>
-        <w:rPr>
-          <w:rFonts w:ascii="Arial" w:eastAsiaTheme="minorEastAsia" w:hAnsi="Arial" w:cs="Arial"/>
-          <w:b/>
-          <w:bCs/>
-          <w:color w:val="577188" w:themeColor="accent1" w:themeShade="BF"/>
-          <w:kern w:val="0"/>
-          <w:sz w:val="28"/>
-          <w:szCs w:val="28"/>
-        </w:rPr>
-      </w:pPr>
-      <w:r>
-        <w:rPr>
-          <w:rFonts w:ascii="Arial" w:eastAsiaTheme="minorEastAsia" w:hAnsi="Arial" w:cs="Arial"/>
-          <w:b/>
-          <w:bCs/>
-          <w:color w:val="577188" w:themeColor="accent1" w:themeShade="BF"/>
-          <w:kern w:val="0"/>
-          <w:sz w:val="28"/>
-          <w:szCs w:val="28"/>
-        </w:rPr>
-        <w:t>Diagrama de solução</w:t>
-      </w:r>
-    </w:p>
-    <w:p>
-      <w:pPr>
-        <w:spacing w:before="100" w:beforeAutospacing="1" w:after="100" w:afterAutospacing="1" w:line="240" w:lineRule="auto"/>
-        <w:rPr>
-          <w:rFonts w:ascii="Arial" w:eastAsiaTheme="minorEastAsia" w:hAnsi="Arial" w:cs="Arial"/>
-          <w:b/>
-          <w:bCs/>
-          <w:color w:val="577188" w:themeColor="accent1" w:themeShade="BF"/>
-          <w:kern w:val="0"/>
-          <w:sz w:val="28"/>
-          <w:szCs w:val="28"/>
-        </w:rPr>
-      </w:pPr>
-    </w:p>
-    <w:p>
-      <w:pPr>
-        <w:spacing w:before="100" w:beforeAutospacing="1" w:after="100" w:afterAutospacing="1" w:line="240" w:lineRule="auto"/>
-        <w:rPr>
-          <w:rFonts w:ascii="Arial" w:eastAsiaTheme="minorEastAsia" w:hAnsi="Arial" w:cs="Arial"/>
-          <w:b/>
-          <w:bCs/>
-          <w:color w:val="577188" w:themeColor="accent1" w:themeShade="BF"/>
-          <w:kern w:val="0"/>
           <w:sz w:val="32"/>
           <w:szCs w:val="32"/>
         </w:rPr>
@@ -1926,6 +1860,7 @@
           <w:sz w:val="32"/>
           <w:szCs w:val="32"/>
         </w:rPr>
+        <w:lastRenderedPageBreak/>
         <w:t>Referências</w:t>
       </w:r>
     </w:p>
@@ -4044,9 +3979,11 @@
   </w:compat>
   <w:rsids>
     <w:rsidRoot w:val="00DF2822"/>
+    <w:rsid w:val="00151051"/>
     <w:rsid w:val="0032558A"/>
     <w:rsid w:val="00336CFE"/>
     <w:rsid w:val="004A7524"/>
+    <w:rsid w:val="004B20C7"/>
     <w:rsid w:val="00562C65"/>
     <w:rsid w:val="00C829A1"/>
     <w:rsid w:val="00D83CEB"/>
@@ -4838,12 +4775,130 @@
 </file>
 
 <file path=customXml/item3.xml><?xml version="1.0" encoding="utf-8"?>
-<?mso-contentType ?>
-<FormTemplates xmlns="http://schemas.microsoft.com/sharepoint/v3/contenttype/forms">
-  <Display>DocumentLibraryForm</Display>
-  <Edit>AssetEditForm</Edit>
-  <New>DocumentLibraryForm</New>
-</FormTemplates>
+<p:properties xmlns:p="http://schemas.microsoft.com/office/2006/metadata/properties" xmlns:xsi="http://www.w3.org/2001/XMLSchema-instance" xmlns:pc="http://schemas.microsoft.com/office/infopath/2007/PartnerControls">
+  <documentManagement>
+    <DirectSourceMarket xmlns="e5d022ff-4ce9-4922-b5a4-f245e35e2aac">english</DirectSourceMarket>
+    <LocComments xmlns="e5d022ff-4ce9-4922-b5a4-f245e35e2aac" xsi:nil="true"/>
+    <MarketSpecific xmlns="e5d022ff-4ce9-4922-b5a4-f245e35e2aac">false</MarketSpecific>
+    <ApprovalStatus xmlns="e5d022ff-4ce9-4922-b5a4-f245e35e2aac">InProgress</ApprovalStatus>
+    <ThumbnailAssetId xmlns="e5d022ff-4ce9-4922-b5a4-f245e35e2aac" xsi:nil="true"/>
+    <PrimaryImageGen xmlns="e5d022ff-4ce9-4922-b5a4-f245e35e2aac">true</PrimaryImageGen>
+    <LegacyData xmlns="e5d022ff-4ce9-4922-b5a4-f245e35e2aac" xsi:nil="true"/>
+    <TPFriendlyName xmlns="e5d022ff-4ce9-4922-b5a4-f245e35e2aac" xsi:nil="true"/>
+    <NumericId xmlns="e5d022ff-4ce9-4922-b5a4-f245e35e2aac" xsi:nil="true"/>
+    <LocRecommendedHandoff xmlns="e5d022ff-4ce9-4922-b5a4-f245e35e2aac" xsi:nil="true"/>
+    <BlockPublish xmlns="e5d022ff-4ce9-4922-b5a4-f245e35e2aac">false</BlockPublish>
+    <BusinessGroup xmlns="e5d022ff-4ce9-4922-b5a4-f245e35e2aac" xsi:nil="true"/>
+    <SourceTitle xmlns="e5d022ff-4ce9-4922-b5a4-f245e35e2aac" xsi:nil="true"/>
+    <OpenTemplate xmlns="e5d022ff-4ce9-4922-b5a4-f245e35e2aac">true</OpenTemplate>
+    <APEditor xmlns="e5d022ff-4ce9-4922-b5a4-f245e35e2aac">
+      <UserInfo>
+        <DisplayName/>
+        <AccountId xsi:nil="true"/>
+        <AccountType/>
+      </UserInfo>
+    </APEditor>
+    <UALocComments xmlns="e5d022ff-4ce9-4922-b5a4-f245e35e2aac" xsi:nil="true"/>
+    <ParentAssetId xmlns="e5d022ff-4ce9-4922-b5a4-f245e35e2aac" xsi:nil="true"/>
+    <PublishStatusLookup xmlns="e5d022ff-4ce9-4922-b5a4-f245e35e2aac">
+      <Value>417660</Value>
+      <Value>417661</Value>
+    </PublishStatusLookup>
+    <FeatureTagsTaxHTField0 xmlns="e5d022ff-4ce9-4922-b5a4-f245e35e2aac">
+      <Terms xmlns="http://schemas.microsoft.com/office/infopath/2007/PartnerControls"/>
+    </FeatureTagsTaxHTField0>
+    <IntlLangReviewDate xmlns="e5d022ff-4ce9-4922-b5a4-f245e35e2aac" xsi:nil="true"/>
+    <Providers xmlns="e5d022ff-4ce9-4922-b5a4-f245e35e2aac" xsi:nil="true"/>
+    <MachineTranslated xmlns="e5d022ff-4ce9-4922-b5a4-f245e35e2aac">false</MachineTranslated>
+    <OriginalSourceMarket xmlns="e5d022ff-4ce9-4922-b5a4-f245e35e2aac">english</OriginalSourceMarket>
+    <APDescription xmlns="e5d022ff-4ce9-4922-b5a4-f245e35e2aac">Use esse currículo elegante para uma aparência profissional. Acompanhe-o com uma carta de apresentação do conjunto de designs Atemporal para causar uma boa impressão.
+</APDescription>
+    <TPInstallLocation xmlns="e5d022ff-4ce9-4922-b5a4-f245e35e2aac" xsi:nil="true"/>
+    <ContentItem xmlns="e5d022ff-4ce9-4922-b5a4-f245e35e2aac" xsi:nil="true"/>
+    <ClipArtFilename xmlns="e5d022ff-4ce9-4922-b5a4-f245e35e2aac" xsi:nil="true"/>
+    <PublishTargets xmlns="e5d022ff-4ce9-4922-b5a4-f245e35e2aac">OfficeOnlineVNext,OfflineBuild</PublishTargets>
+    <TimesCloned xmlns="e5d022ff-4ce9-4922-b5a4-f245e35e2aac" xsi:nil="true"/>
+    <FriendlyTitle xmlns="e5d022ff-4ce9-4922-b5a4-f245e35e2aac" xsi:nil="true"/>
+    <AcquiredFrom xmlns="e5d022ff-4ce9-4922-b5a4-f245e35e2aac">Internal MS</AcquiredFrom>
+    <AssetStart xmlns="e5d022ff-4ce9-4922-b5a4-f245e35e2aac">2012-03-08T00:28:00+00:00</AssetStart>
+    <Provider xmlns="e5d022ff-4ce9-4922-b5a4-f245e35e2aac" xsi:nil="true"/>
+    <LastHandOff xmlns="e5d022ff-4ce9-4922-b5a4-f245e35e2aac" xsi:nil="true"/>
+    <LocalizationTagsTaxHTField0 xmlns="e5d022ff-4ce9-4922-b5a4-f245e35e2aac">
+      <Terms xmlns="http://schemas.microsoft.com/office/infopath/2007/PartnerControls"/>
+    </LocalizationTagsTaxHTField0>
+    <TPClientViewer xmlns="e5d022ff-4ce9-4922-b5a4-f245e35e2aac" xsi:nil="true"/>
+    <UACurrentWords xmlns="e5d022ff-4ce9-4922-b5a4-f245e35e2aac" xsi:nil="true"/>
+    <ArtSampleDocs xmlns="e5d022ff-4ce9-4922-b5a4-f245e35e2aac" xsi:nil="true"/>
+    <UALocRecommendation xmlns="e5d022ff-4ce9-4922-b5a4-f245e35e2aac">Localize</UALocRecommendation>
+    <Manager xmlns="e5d022ff-4ce9-4922-b5a4-f245e35e2aac" xsi:nil="true"/>
+    <CSXHash xmlns="e5d022ff-4ce9-4922-b5a4-f245e35e2aac" xsi:nil="true"/>
+    <IsDeleted xmlns="e5d022ff-4ce9-4922-b5a4-f245e35e2aac">false</IsDeleted>
+    <ShowIn xmlns="e5d022ff-4ce9-4922-b5a4-f245e35e2aac">Show everywhere</ShowIn>
+    <UANotes xmlns="e5d022ff-4ce9-4922-b5a4-f245e35e2aac" xsi:nil="true"/>
+    <TemplateStatus xmlns="e5d022ff-4ce9-4922-b5a4-f245e35e2aac">Complete</TemplateStatus>
+    <Downloads xmlns="e5d022ff-4ce9-4922-b5a4-f245e35e2aac">0</Downloads>
+    <VoteCount xmlns="e5d022ff-4ce9-4922-b5a4-f245e35e2aac" xsi:nil="true"/>
+    <OOCacheId xmlns="e5d022ff-4ce9-4922-b5a4-f245e35e2aac" xsi:nil="true"/>
+    <InternalTagsTaxHTField0 xmlns="e5d022ff-4ce9-4922-b5a4-f245e35e2aac">
+      <Terms xmlns="http://schemas.microsoft.com/office/infopath/2007/PartnerControls"/>
+    </InternalTagsTaxHTField0>
+    <AssetExpire xmlns="e5d022ff-4ce9-4922-b5a4-f245e35e2aac">2029-01-01T08:00:00+00:00</AssetExpire>
+    <CSXSubmissionMarket xmlns="e5d022ff-4ce9-4922-b5a4-f245e35e2aac" xsi:nil="true"/>
+    <DSATActionTaken xmlns="e5d022ff-4ce9-4922-b5a4-f245e35e2aac" xsi:nil="true"/>
+    <TPExecutable xmlns="e5d022ff-4ce9-4922-b5a4-f245e35e2aac" xsi:nil="true"/>
+    <SubmitterId xmlns="e5d022ff-4ce9-4922-b5a4-f245e35e2aac" xsi:nil="true"/>
+    <EditorialTags xmlns="e5d022ff-4ce9-4922-b5a4-f245e35e2aac" xsi:nil="true"/>
+    <AssetType xmlns="e5d022ff-4ce9-4922-b5a4-f245e35e2aac">TP</AssetType>
+    <CSXSubmissionDate xmlns="e5d022ff-4ce9-4922-b5a4-f245e35e2aac" xsi:nil="true"/>
+    <CSXUpdate xmlns="e5d022ff-4ce9-4922-b5a4-f245e35e2aac">false</CSXUpdate>
+    <ApprovalLog xmlns="e5d022ff-4ce9-4922-b5a4-f245e35e2aac" xsi:nil="true"/>
+    <BugNumber xmlns="e5d022ff-4ce9-4922-b5a4-f245e35e2aac" xsi:nil="true"/>
+    <Milestone xmlns="e5d022ff-4ce9-4922-b5a4-f245e35e2aac" xsi:nil="true"/>
+    <OriginAsset xmlns="e5d022ff-4ce9-4922-b5a4-f245e35e2aac" xsi:nil="true"/>
+    <TPComponent xmlns="e5d022ff-4ce9-4922-b5a4-f245e35e2aac" xsi:nil="true"/>
+    <RecommendationsModifier xmlns="e5d022ff-4ce9-4922-b5a4-f245e35e2aac">1000</RecommendationsModifier>
+    <AssetId xmlns="e5d022ff-4ce9-4922-b5a4-f245e35e2aac">TP102835054</AssetId>
+    <TPApplication xmlns="e5d022ff-4ce9-4922-b5a4-f245e35e2aac" xsi:nil="true"/>
+    <TPLaunchHelpLink xmlns="e5d022ff-4ce9-4922-b5a4-f245e35e2aac" xsi:nil="true"/>
+    <PolicheckWords xmlns="e5d022ff-4ce9-4922-b5a4-f245e35e2aac" xsi:nil="true"/>
+    <IntlLocPriority xmlns="e5d022ff-4ce9-4922-b5a4-f245e35e2aac" xsi:nil="true"/>
+    <CrawlForDependencies xmlns="e5d022ff-4ce9-4922-b5a4-f245e35e2aac">false</CrawlForDependencies>
+    <IntlLangReviewer xmlns="e5d022ff-4ce9-4922-b5a4-f245e35e2aac" xsi:nil="true"/>
+    <HandoffToMSDN xmlns="e5d022ff-4ce9-4922-b5a4-f245e35e2aac" xsi:nil="true"/>
+    <PlannedPubDate xmlns="e5d022ff-4ce9-4922-b5a4-f245e35e2aac" xsi:nil="true"/>
+    <TrustLevel xmlns="e5d022ff-4ce9-4922-b5a4-f245e35e2aac">1 Microsoft Managed Content</TrustLevel>
+    <LocLastLocAttemptVersionLookup xmlns="e5d022ff-4ce9-4922-b5a4-f245e35e2aac">827850</LocLastLocAttemptVersionLookup>
+    <TemplateTemplateType xmlns="e5d022ff-4ce9-4922-b5a4-f245e35e2aac">Word Document Template</TemplateTemplateType>
+    <IsSearchable xmlns="e5d022ff-4ce9-4922-b5a4-f245e35e2aac">true</IsSearchable>
+    <TPNamespace xmlns="e5d022ff-4ce9-4922-b5a4-f245e35e2aac" xsi:nil="true"/>
+    <CampaignTagsTaxHTField0 xmlns="e5d022ff-4ce9-4922-b5a4-f245e35e2aac">
+      <Terms xmlns="http://schemas.microsoft.com/office/infopath/2007/PartnerControls"/>
+    </CampaignTagsTaxHTField0>
+    <TaxCatchAll xmlns="e5d022ff-4ce9-4922-b5a4-f245e35e2aac"/>
+    <Markets xmlns="e5d022ff-4ce9-4922-b5a4-f245e35e2aac"/>
+    <IntlLangReview xmlns="e5d022ff-4ce9-4922-b5a4-f245e35e2aac">false</IntlLangReview>
+    <UAProjectedTotalWords xmlns="e5d022ff-4ce9-4922-b5a4-f245e35e2aac" xsi:nil="true"/>
+    <OutputCachingOn xmlns="e5d022ff-4ce9-4922-b5a4-f245e35e2aac">false</OutputCachingOn>
+    <LocMarketGroupTiers2 xmlns="e5d022ff-4ce9-4922-b5a4-f245e35e2aac" xsi:nil="true"/>
+    <TPAppVersion xmlns="e5d022ff-4ce9-4922-b5a4-f245e35e2aac" xsi:nil="true"/>
+    <TPCommandLine xmlns="e5d022ff-4ce9-4922-b5a4-f245e35e2aac" xsi:nil="true"/>
+    <APAuthor xmlns="e5d022ff-4ce9-4922-b5a4-f245e35e2aac">
+      <UserInfo>
+        <DisplayName>REDMOND\kristaa</DisplayName>
+        <AccountId>81</AccountId>
+        <AccountType/>
+      </UserInfo>
+    </APAuthor>
+    <LocManualTestRequired xmlns="e5d022ff-4ce9-4922-b5a4-f245e35e2aac">false</LocManualTestRequired>
+    <EditorialStatus xmlns="e5d022ff-4ce9-4922-b5a4-f245e35e2aac">Complete</EditorialStatus>
+    <TPLaunchHelpLinkType xmlns="e5d022ff-4ce9-4922-b5a4-f245e35e2aac">Template</TPLaunchHelpLinkType>
+    <OriginalRelease xmlns="e5d022ff-4ce9-4922-b5a4-f245e35e2aac">15</OriginalRelease>
+    <LastModifiedDateTime xmlns="e5d022ff-4ce9-4922-b5a4-f245e35e2aac" xsi:nil="true"/>
+    <ScenarioTagsTaxHTField0 xmlns="e5d022ff-4ce9-4922-b5a4-f245e35e2aac">
+      <Terms xmlns="http://schemas.microsoft.com/office/infopath/2007/PartnerControls"/>
+    </ScenarioTagsTaxHTField0>
+  </documentManagement>
+</p:properties>
 </file>
 
 <file path=customXml/item4.xml><?xml version="1.0" encoding="utf-8"?>
@@ -5881,130 +5936,12 @@
 </file>
 
 <file path=customXml/item5.xml><?xml version="1.0" encoding="utf-8"?>
-<p:properties xmlns:p="http://schemas.microsoft.com/office/2006/metadata/properties" xmlns:xsi="http://www.w3.org/2001/XMLSchema-instance" xmlns:pc="http://schemas.microsoft.com/office/infopath/2007/PartnerControls">
-  <documentManagement>
-    <DirectSourceMarket xmlns="e5d022ff-4ce9-4922-b5a4-f245e35e2aac">english</DirectSourceMarket>
-    <LocComments xmlns="e5d022ff-4ce9-4922-b5a4-f245e35e2aac" xsi:nil="true"/>
-    <MarketSpecific xmlns="e5d022ff-4ce9-4922-b5a4-f245e35e2aac">false</MarketSpecific>
-    <ApprovalStatus xmlns="e5d022ff-4ce9-4922-b5a4-f245e35e2aac">InProgress</ApprovalStatus>
-    <ThumbnailAssetId xmlns="e5d022ff-4ce9-4922-b5a4-f245e35e2aac" xsi:nil="true"/>
-    <PrimaryImageGen xmlns="e5d022ff-4ce9-4922-b5a4-f245e35e2aac">true</PrimaryImageGen>
-    <LegacyData xmlns="e5d022ff-4ce9-4922-b5a4-f245e35e2aac" xsi:nil="true"/>
-    <TPFriendlyName xmlns="e5d022ff-4ce9-4922-b5a4-f245e35e2aac" xsi:nil="true"/>
-    <NumericId xmlns="e5d022ff-4ce9-4922-b5a4-f245e35e2aac" xsi:nil="true"/>
-    <LocRecommendedHandoff xmlns="e5d022ff-4ce9-4922-b5a4-f245e35e2aac" xsi:nil="true"/>
-    <BlockPublish xmlns="e5d022ff-4ce9-4922-b5a4-f245e35e2aac">false</BlockPublish>
-    <BusinessGroup xmlns="e5d022ff-4ce9-4922-b5a4-f245e35e2aac" xsi:nil="true"/>
-    <SourceTitle xmlns="e5d022ff-4ce9-4922-b5a4-f245e35e2aac" xsi:nil="true"/>
-    <OpenTemplate xmlns="e5d022ff-4ce9-4922-b5a4-f245e35e2aac">true</OpenTemplate>
-    <APEditor xmlns="e5d022ff-4ce9-4922-b5a4-f245e35e2aac">
-      <UserInfo>
-        <DisplayName/>
-        <AccountId xsi:nil="true"/>
-        <AccountType/>
-      </UserInfo>
-    </APEditor>
-    <UALocComments xmlns="e5d022ff-4ce9-4922-b5a4-f245e35e2aac" xsi:nil="true"/>
-    <ParentAssetId xmlns="e5d022ff-4ce9-4922-b5a4-f245e35e2aac" xsi:nil="true"/>
-    <PublishStatusLookup xmlns="e5d022ff-4ce9-4922-b5a4-f245e35e2aac">
-      <Value>417660</Value>
-      <Value>417661</Value>
-    </PublishStatusLookup>
-    <FeatureTagsTaxHTField0 xmlns="e5d022ff-4ce9-4922-b5a4-f245e35e2aac">
-      <Terms xmlns="http://schemas.microsoft.com/office/infopath/2007/PartnerControls"/>
-    </FeatureTagsTaxHTField0>
-    <IntlLangReviewDate xmlns="e5d022ff-4ce9-4922-b5a4-f245e35e2aac" xsi:nil="true"/>
-    <Providers xmlns="e5d022ff-4ce9-4922-b5a4-f245e35e2aac" xsi:nil="true"/>
-    <MachineTranslated xmlns="e5d022ff-4ce9-4922-b5a4-f245e35e2aac">false</MachineTranslated>
-    <OriginalSourceMarket xmlns="e5d022ff-4ce9-4922-b5a4-f245e35e2aac">english</OriginalSourceMarket>
-    <APDescription xmlns="e5d022ff-4ce9-4922-b5a4-f245e35e2aac">Use esse currículo elegante para uma aparência profissional. Acompanhe-o com uma carta de apresentação do conjunto de designs Atemporal para causar uma boa impressão.
-</APDescription>
-    <TPInstallLocation xmlns="e5d022ff-4ce9-4922-b5a4-f245e35e2aac" xsi:nil="true"/>
-    <ContentItem xmlns="e5d022ff-4ce9-4922-b5a4-f245e35e2aac" xsi:nil="true"/>
-    <ClipArtFilename xmlns="e5d022ff-4ce9-4922-b5a4-f245e35e2aac" xsi:nil="true"/>
-    <PublishTargets xmlns="e5d022ff-4ce9-4922-b5a4-f245e35e2aac">OfficeOnlineVNext,OfflineBuild</PublishTargets>
-    <TimesCloned xmlns="e5d022ff-4ce9-4922-b5a4-f245e35e2aac" xsi:nil="true"/>
-    <FriendlyTitle xmlns="e5d022ff-4ce9-4922-b5a4-f245e35e2aac" xsi:nil="true"/>
-    <AcquiredFrom xmlns="e5d022ff-4ce9-4922-b5a4-f245e35e2aac">Internal MS</AcquiredFrom>
-    <AssetStart xmlns="e5d022ff-4ce9-4922-b5a4-f245e35e2aac">2012-03-08T00:28:00+00:00</AssetStart>
-    <Provider xmlns="e5d022ff-4ce9-4922-b5a4-f245e35e2aac" xsi:nil="true"/>
-    <LastHandOff xmlns="e5d022ff-4ce9-4922-b5a4-f245e35e2aac" xsi:nil="true"/>
-    <LocalizationTagsTaxHTField0 xmlns="e5d022ff-4ce9-4922-b5a4-f245e35e2aac">
-      <Terms xmlns="http://schemas.microsoft.com/office/infopath/2007/PartnerControls"/>
-    </LocalizationTagsTaxHTField0>
-    <TPClientViewer xmlns="e5d022ff-4ce9-4922-b5a4-f245e35e2aac" xsi:nil="true"/>
-    <UACurrentWords xmlns="e5d022ff-4ce9-4922-b5a4-f245e35e2aac" xsi:nil="true"/>
-    <ArtSampleDocs xmlns="e5d022ff-4ce9-4922-b5a4-f245e35e2aac" xsi:nil="true"/>
-    <UALocRecommendation xmlns="e5d022ff-4ce9-4922-b5a4-f245e35e2aac">Localize</UALocRecommendation>
-    <Manager xmlns="e5d022ff-4ce9-4922-b5a4-f245e35e2aac" xsi:nil="true"/>
-    <CSXHash xmlns="e5d022ff-4ce9-4922-b5a4-f245e35e2aac" xsi:nil="true"/>
-    <IsDeleted xmlns="e5d022ff-4ce9-4922-b5a4-f245e35e2aac">false</IsDeleted>
-    <ShowIn xmlns="e5d022ff-4ce9-4922-b5a4-f245e35e2aac">Show everywhere</ShowIn>
-    <UANotes xmlns="e5d022ff-4ce9-4922-b5a4-f245e35e2aac" xsi:nil="true"/>
-    <TemplateStatus xmlns="e5d022ff-4ce9-4922-b5a4-f245e35e2aac">Complete</TemplateStatus>
-    <Downloads xmlns="e5d022ff-4ce9-4922-b5a4-f245e35e2aac">0</Downloads>
-    <VoteCount xmlns="e5d022ff-4ce9-4922-b5a4-f245e35e2aac" xsi:nil="true"/>
-    <OOCacheId xmlns="e5d022ff-4ce9-4922-b5a4-f245e35e2aac" xsi:nil="true"/>
-    <InternalTagsTaxHTField0 xmlns="e5d022ff-4ce9-4922-b5a4-f245e35e2aac">
-      <Terms xmlns="http://schemas.microsoft.com/office/infopath/2007/PartnerControls"/>
-    </InternalTagsTaxHTField0>
-    <AssetExpire xmlns="e5d022ff-4ce9-4922-b5a4-f245e35e2aac">2029-01-01T08:00:00+00:00</AssetExpire>
-    <CSXSubmissionMarket xmlns="e5d022ff-4ce9-4922-b5a4-f245e35e2aac" xsi:nil="true"/>
-    <DSATActionTaken xmlns="e5d022ff-4ce9-4922-b5a4-f245e35e2aac" xsi:nil="true"/>
-    <TPExecutable xmlns="e5d022ff-4ce9-4922-b5a4-f245e35e2aac" xsi:nil="true"/>
-    <SubmitterId xmlns="e5d022ff-4ce9-4922-b5a4-f245e35e2aac" xsi:nil="true"/>
-    <EditorialTags xmlns="e5d022ff-4ce9-4922-b5a4-f245e35e2aac" xsi:nil="true"/>
-    <AssetType xmlns="e5d022ff-4ce9-4922-b5a4-f245e35e2aac">TP</AssetType>
-    <CSXSubmissionDate xmlns="e5d022ff-4ce9-4922-b5a4-f245e35e2aac" xsi:nil="true"/>
-    <CSXUpdate xmlns="e5d022ff-4ce9-4922-b5a4-f245e35e2aac">false</CSXUpdate>
-    <ApprovalLog xmlns="e5d022ff-4ce9-4922-b5a4-f245e35e2aac" xsi:nil="true"/>
-    <BugNumber xmlns="e5d022ff-4ce9-4922-b5a4-f245e35e2aac" xsi:nil="true"/>
-    <Milestone xmlns="e5d022ff-4ce9-4922-b5a4-f245e35e2aac" xsi:nil="true"/>
-    <OriginAsset xmlns="e5d022ff-4ce9-4922-b5a4-f245e35e2aac" xsi:nil="true"/>
-    <TPComponent xmlns="e5d022ff-4ce9-4922-b5a4-f245e35e2aac" xsi:nil="true"/>
-    <RecommendationsModifier xmlns="e5d022ff-4ce9-4922-b5a4-f245e35e2aac">1000</RecommendationsModifier>
-    <AssetId xmlns="e5d022ff-4ce9-4922-b5a4-f245e35e2aac">TP102835054</AssetId>
-    <TPApplication xmlns="e5d022ff-4ce9-4922-b5a4-f245e35e2aac" xsi:nil="true"/>
-    <TPLaunchHelpLink xmlns="e5d022ff-4ce9-4922-b5a4-f245e35e2aac" xsi:nil="true"/>
-    <PolicheckWords xmlns="e5d022ff-4ce9-4922-b5a4-f245e35e2aac" xsi:nil="true"/>
-    <IntlLocPriority xmlns="e5d022ff-4ce9-4922-b5a4-f245e35e2aac" xsi:nil="true"/>
-    <CrawlForDependencies xmlns="e5d022ff-4ce9-4922-b5a4-f245e35e2aac">false</CrawlForDependencies>
-    <IntlLangReviewer xmlns="e5d022ff-4ce9-4922-b5a4-f245e35e2aac" xsi:nil="true"/>
-    <HandoffToMSDN xmlns="e5d022ff-4ce9-4922-b5a4-f245e35e2aac" xsi:nil="true"/>
-    <PlannedPubDate xmlns="e5d022ff-4ce9-4922-b5a4-f245e35e2aac" xsi:nil="true"/>
-    <TrustLevel xmlns="e5d022ff-4ce9-4922-b5a4-f245e35e2aac">1 Microsoft Managed Content</TrustLevel>
-    <LocLastLocAttemptVersionLookup xmlns="e5d022ff-4ce9-4922-b5a4-f245e35e2aac">827850</LocLastLocAttemptVersionLookup>
-    <TemplateTemplateType xmlns="e5d022ff-4ce9-4922-b5a4-f245e35e2aac">Word Document Template</TemplateTemplateType>
-    <IsSearchable xmlns="e5d022ff-4ce9-4922-b5a4-f245e35e2aac">true</IsSearchable>
-    <TPNamespace xmlns="e5d022ff-4ce9-4922-b5a4-f245e35e2aac" xsi:nil="true"/>
-    <CampaignTagsTaxHTField0 xmlns="e5d022ff-4ce9-4922-b5a4-f245e35e2aac">
-      <Terms xmlns="http://schemas.microsoft.com/office/infopath/2007/PartnerControls"/>
-    </CampaignTagsTaxHTField0>
-    <TaxCatchAll xmlns="e5d022ff-4ce9-4922-b5a4-f245e35e2aac"/>
-    <Markets xmlns="e5d022ff-4ce9-4922-b5a4-f245e35e2aac"/>
-    <IntlLangReview xmlns="e5d022ff-4ce9-4922-b5a4-f245e35e2aac">false</IntlLangReview>
-    <UAProjectedTotalWords xmlns="e5d022ff-4ce9-4922-b5a4-f245e35e2aac" xsi:nil="true"/>
-    <OutputCachingOn xmlns="e5d022ff-4ce9-4922-b5a4-f245e35e2aac">false</OutputCachingOn>
-    <LocMarketGroupTiers2 xmlns="e5d022ff-4ce9-4922-b5a4-f245e35e2aac" xsi:nil="true"/>
-    <TPAppVersion xmlns="e5d022ff-4ce9-4922-b5a4-f245e35e2aac" xsi:nil="true"/>
-    <TPCommandLine xmlns="e5d022ff-4ce9-4922-b5a4-f245e35e2aac" xsi:nil="true"/>
-    <APAuthor xmlns="e5d022ff-4ce9-4922-b5a4-f245e35e2aac">
-      <UserInfo>
-        <DisplayName>REDMOND\kristaa</DisplayName>
-        <AccountId>81</AccountId>
-        <AccountType/>
-      </UserInfo>
-    </APAuthor>
-    <LocManualTestRequired xmlns="e5d022ff-4ce9-4922-b5a4-f245e35e2aac">false</LocManualTestRequired>
-    <EditorialStatus xmlns="e5d022ff-4ce9-4922-b5a4-f245e35e2aac">Complete</EditorialStatus>
-    <TPLaunchHelpLinkType xmlns="e5d022ff-4ce9-4922-b5a4-f245e35e2aac">Template</TPLaunchHelpLinkType>
-    <OriginalRelease xmlns="e5d022ff-4ce9-4922-b5a4-f245e35e2aac">15</OriginalRelease>
-    <LastModifiedDateTime xmlns="e5d022ff-4ce9-4922-b5a4-f245e35e2aac" xsi:nil="true"/>
-    <ScenarioTagsTaxHTField0 xmlns="e5d022ff-4ce9-4922-b5a4-f245e35e2aac">
-      <Terms xmlns="http://schemas.microsoft.com/office/infopath/2007/PartnerControls"/>
-    </ScenarioTagsTaxHTField0>
-  </documentManagement>
-</p:properties>
+<?mso-contentType ?>
+<FormTemplates xmlns="http://schemas.microsoft.com/sharepoint/v3/contenttype/forms">
+  <Display>DocumentLibraryForm</Display>
+  <Edit>AssetEditForm</Edit>
+  <New>DocumentLibraryForm</New>
+</FormTemplates>
 </file>
 
 <file path=customXml/itemProps1.xml><?xml version="1.0" encoding="utf-8"?>
@@ -6024,9 +5961,11 @@
 </file>
 
 <file path=customXml/itemProps3.xml><?xml version="1.0" encoding="utf-8"?>
-<ds:datastoreItem xmlns:ds="http://schemas.openxmlformats.org/officeDocument/2006/customXml" ds:itemID="{A0077783-2CE4-4ACE-A7FB-5A37CE1D65A3}">
+<ds:datastoreItem xmlns:ds="http://schemas.openxmlformats.org/officeDocument/2006/customXml" ds:itemID="{D3EBC2B9-6CE6-485C-8397-87D481EF78BE}">
   <ds:schemaRefs>
-    <ds:schemaRef ds:uri="http://schemas.microsoft.com/sharepoint/v3/contenttype/forms"/>
+    <ds:schemaRef ds:uri="http://schemas.microsoft.com/office/2006/metadata/properties"/>
+    <ds:schemaRef ds:uri="http://schemas.microsoft.com/office/infopath/2007/PartnerControls"/>
+    <ds:schemaRef ds:uri="e5d022ff-4ce9-4922-b5a4-f245e35e2aac"/>
   </ds:schemaRefs>
 </ds:datastoreItem>
 </file>
@@ -6050,11 +5989,9 @@
 </file>
 
 <file path=customXml/itemProps5.xml><?xml version="1.0" encoding="utf-8"?>
-<ds:datastoreItem xmlns:ds="http://schemas.openxmlformats.org/officeDocument/2006/customXml" ds:itemID="{D3EBC2B9-6CE6-485C-8397-87D481EF78BE}">
+<ds:datastoreItem xmlns:ds="http://schemas.openxmlformats.org/officeDocument/2006/customXml" ds:itemID="{A0077783-2CE4-4ACE-A7FB-5A37CE1D65A3}">
   <ds:schemaRefs>
-    <ds:schemaRef ds:uri="http://schemas.microsoft.com/office/2006/metadata/properties"/>
-    <ds:schemaRef ds:uri="http://schemas.microsoft.com/office/infopath/2007/PartnerControls"/>
-    <ds:schemaRef ds:uri="e5d022ff-4ce9-4922-b5a4-f245e35e2aac"/>
+    <ds:schemaRef ds:uri="http://schemas.microsoft.com/sharepoint/v3/contenttype/forms"/>
   </ds:schemaRefs>
 </ds:datastoreItem>
 </file>
</xml_diff>